<commit_message>
Improve built-in document typography and printable preview layout
</commit_message>
<xml_diff>
--- a/templates/FGPC-012-01-decision-report-kr.docx
+++ b/templates/FGPC-012-01-decision-report-kr.docx
@@ -4,6 +4,9 @@
   <w:body>
     <w:p>
       <w:pPr>
+        <w:pStyle w:val="Title"/>
+        <w:keepNext/>
+        <w:spacing w:before="40" w:after="320" w:line="276" w:lineRule="auto"/>
         <w:jc w:val="center"/>
         <w:rPr>
           <w:b/>
@@ -14,8 +17,9 @@
       </w:pPr>
       <w:r>
         <w:rPr>
-          <w:rFonts w:hint="eastAsia"/>
+          <w:rFonts w:hint="eastAsia" w:ascii="Malgun Gothic" w:hAnsi="Malgun Gothic" w:eastAsia="Malgun Gothic"/>
           <w:b/>
+          <w:color w:val="000000"/>
           <w:sz w:val="40"/>
           <w:szCs w:val="36"/>
           <w:lang w:eastAsia="ko-KR"/>
@@ -25,6 +29,7 @@
     </w:p>
     <w:p>
       <w:pPr>
+        <w:spacing w:before="40" w:after="60" w:line="276" w:lineRule="auto"/>
         <w:rPr>
           <w:lang w:eastAsia="ko-KR"/>
         </w:rPr>
@@ -37,6 +42,7 @@
           <w:ilvl w:val="0"/>
           <w:numId w:val="83"/>
         </w:numPr>
+        <w:spacing w:before="40" w:after="60" w:line="276" w:lineRule="auto"/>
         <w:ind w:leftChars="0"/>
         <w:rPr>
           <w:b/>
@@ -45,24 +51,30 @@
       </w:pPr>
       <w:r>
         <w:rPr>
-          <w:rFonts w:hint="eastAsia"/>
+          <w:rFonts w:hint="eastAsia" w:ascii="Malgun Gothic" w:hAnsi="Malgun Gothic" w:eastAsia="Malgun Gothic"/>
           <w:b/>
+          <w:color w:val="000000"/>
+          <w:sz w:val="22"/>
           <w:lang w:eastAsia="ko-KR"/>
         </w:rPr>
         <w:t>신청</w:t>
       </w:r>
       <w:r>
         <w:rPr>
-          <w:rFonts w:hint="eastAsia"/>
+          <w:rFonts w:hint="eastAsia" w:ascii="Malgun Gothic" w:hAnsi="Malgun Gothic" w:eastAsia="Malgun Gothic"/>
           <w:b/>
+          <w:color w:val="000000"/>
+          <w:sz w:val="22"/>
           <w:lang w:eastAsia="ko-KR"/>
         </w:rPr>
         <w:t xml:space="preserve"> </w:t>
       </w:r>
       <w:r>
         <w:rPr>
-          <w:rFonts w:hint="eastAsia"/>
+          <w:rFonts w:hint="eastAsia" w:ascii="Malgun Gothic" w:hAnsi="Malgun Gothic" w:eastAsia="Malgun Gothic"/>
           <w:b/>
+          <w:color w:val="000000"/>
+          <w:sz w:val="22"/>
           <w:lang w:eastAsia="ko-KR"/>
         </w:rPr>
         <w:t>정보</w:t>
@@ -70,6 +82,7 @@
     </w:p>
     <w:p>
       <w:pPr>
+        <w:spacing w:before="40" w:after="60" w:line="276" w:lineRule="auto"/>
         <w:rPr>
           <w:lang w:eastAsia="ko-KR"/>
         </w:rPr>
@@ -81,6 +94,20 @@
         <w:tblW w:w="9220" w:type="dxa"/>
         <w:tblInd w:w="421" w:type="dxa"/>
         <w:tblLook w:val="04A0" w:firstRow="1" w:lastRow="0" w:firstColumn="1" w:lastColumn="0" w:noHBand="0" w:noVBand="1"/>
+        <w:tblBorders>
+          <w:top w:val="single" w:sz="4" w:color="D9D9D9"/>
+          <w:left w:val="single" w:sz="4" w:color="D9D9D9"/>
+          <w:bottom w:val="single" w:sz="4" w:color="D9D9D9"/>
+          <w:right w:val="single" w:sz="4" w:color="D9D9D9"/>
+          <w:insideH w:val="single" w:sz="4" w:color="D9D9D9"/>
+          <w:insideV w:val="single" w:sz="4" w:color="D9D9D9"/>
+        </w:tblBorders>
+        <w:tblCellMar>
+          <w:top w:w="75" w:type="dxa"/>
+          <w:bottom w:w="75" w:type="dxa"/>
+          <w:left w:w="100" w:type="dxa"/>
+          <w:right w:w="100" w:type="dxa"/>
+        </w:tblCellMar>
       </w:tblPr>
       <w:tblGrid>
         <w:gridCol w:w="1844"/>
@@ -88,16 +115,17 @@
       </w:tblGrid>
       <w:tr>
         <w:trPr>
-          <w:trHeight w:val="329"/>
+          <w:cantSplit/>
         </w:trPr>
         <w:tc>
           <w:tcPr>
             <w:tcW w:w="1844" w:type="dxa"/>
-            <w:shd w:val="clear" w:color="auto" w:fill="D9D9D9" w:themeFill="background1" w:themeFillShade="D9"/>
+            <w:shd w:val="clear" w:color="auto" w:fill="F2F4F7" w:themeFill="background1" w:themeFillShade="D9"/>
             <w:vAlign w:val="center"/>
           </w:tcPr>
           <w:p>
             <w:pPr>
+              <w:spacing w:before="40" w:after="60" w:line="276" w:lineRule="auto"/>
               <w:jc w:val="center"/>
               <w:rPr>
                 <w:sz w:val="22"/>
@@ -106,7 +134,8 @@
             </w:pPr>
             <w:r>
               <w:rPr>
-                <w:rFonts w:hint="eastAsia"/>
+                <w:rFonts w:hint="eastAsia" w:ascii="Malgun Gothic" w:hAnsi="Malgun Gothic" w:eastAsia="Malgun Gothic"/>
+                <w:color w:val="000000"/>
                 <w:sz w:val="22"/>
                 <w:lang w:eastAsia="ko-KR"/>
               </w:rPr>
@@ -114,6 +143,8 @@
             </w:r>
             <w:r>
               <w:rPr>
+                <w:rFonts w:ascii="Malgun Gothic" w:hAnsi="Malgun Gothic" w:eastAsia="Malgun Gothic"/>
+                <w:color w:val="000000"/>
                 <w:sz w:val="22"/>
                 <w:lang w:eastAsia="ko-KR"/>
               </w:rPr>
@@ -121,7 +152,8 @@
             </w:r>
             <w:r>
               <w:rPr>
-                <w:rFonts w:hint="eastAsia"/>
+                <w:rFonts w:hint="eastAsia" w:ascii="Malgun Gothic" w:hAnsi="Malgun Gothic" w:eastAsia="Malgun Gothic"/>
+                <w:color w:val="000000"/>
                 <w:sz w:val="22"/>
                 <w:lang w:eastAsia="ko-KR"/>
               </w:rPr>
@@ -135,7 +167,15 @@
             <w:vAlign w:val="center"/>
           </w:tcPr>
           <w:p>
+            <w:pPr>
+              <w:spacing w:before="40" w:after="60" w:line="276" w:lineRule="auto"/>
+            </w:pPr>
             <w:r>
+              <w:rPr>
+                <w:rFonts w:ascii="Malgun Gothic" w:hAnsi="Malgun Gothic" w:eastAsia="Malgun Gothic"/>
+                <w:color w:val="000000"/>
+                <w:sz w:val="22"/>
+              </w:rPr>
               <w:t>{{candidateName}}</w:t>
             </w:r>
           </w:p>
@@ -143,16 +183,17 @@
       </w:tr>
       <w:tr>
         <w:trPr>
-          <w:trHeight w:val="407"/>
+          <w:cantSplit/>
         </w:trPr>
         <w:tc>
           <w:tcPr>
             <w:tcW w:w="1844" w:type="dxa"/>
-            <w:shd w:val="clear" w:color="auto" w:fill="D9D9D9" w:themeFill="background1" w:themeFillShade="D9"/>
+            <w:shd w:val="clear" w:color="auto" w:fill="F2F4F7" w:themeFill="background1" w:themeFillShade="D9"/>
             <w:vAlign w:val="center"/>
           </w:tcPr>
           <w:p>
             <w:pPr>
+              <w:spacing w:before="40" w:after="60" w:line="276" w:lineRule="auto"/>
               <w:jc w:val="center"/>
               <w:rPr>
                 <w:sz w:val="22"/>
@@ -161,7 +202,8 @@
             </w:pPr>
             <w:r>
               <w:rPr>
-                <w:rFonts w:hint="eastAsia"/>
+                <w:rFonts w:hint="eastAsia" w:ascii="Malgun Gothic" w:hAnsi="Malgun Gothic" w:eastAsia="Malgun Gothic"/>
+                <w:color w:val="000000"/>
                 <w:sz w:val="22"/>
                 <w:lang w:eastAsia="ko-KR"/>
               </w:rPr>
@@ -175,7 +217,15 @@
             <w:vAlign w:val="center"/>
           </w:tcPr>
           <w:p>
+            <w:pPr>
+              <w:spacing w:before="40" w:after="60" w:line="276" w:lineRule="auto"/>
+            </w:pPr>
             <w:r>
+              <w:rPr>
+                <w:rFonts w:ascii="Malgun Gothic" w:hAnsi="Malgun Gothic" w:eastAsia="Malgun Gothic"/>
+                <w:color w:val="000000"/>
+                <w:sz w:val="22"/>
+              </w:rPr>
               <w:t>{{jobNo}}</w:t>
             </w:r>
           </w:p>
@@ -183,16 +233,17 @@
       </w:tr>
       <w:tr>
         <w:trPr>
-          <w:trHeight w:val="333"/>
+          <w:cantSplit/>
         </w:trPr>
         <w:tc>
           <w:tcPr>
             <w:tcW w:w="1844" w:type="dxa"/>
-            <w:shd w:val="clear" w:color="auto" w:fill="D9D9D9" w:themeFill="background1" w:themeFillShade="D9"/>
+            <w:shd w:val="clear" w:color="auto" w:fill="F2F4F7" w:themeFill="background1" w:themeFillShade="D9"/>
             <w:vAlign w:val="center"/>
           </w:tcPr>
           <w:p>
             <w:pPr>
+              <w:spacing w:before="40" w:after="60" w:line="276" w:lineRule="auto"/>
               <w:jc w:val="center"/>
               <w:rPr>
                 <w:sz w:val="22"/>
@@ -201,7 +252,8 @@
             </w:pPr>
             <w:r>
               <w:rPr>
-                <w:rFonts w:hint="eastAsia"/>
+                <w:rFonts w:hint="eastAsia" w:ascii="Malgun Gothic" w:hAnsi="Malgun Gothic" w:eastAsia="Malgun Gothic"/>
+                <w:color w:val="000000"/>
                 <w:sz w:val="22"/>
                 <w:lang w:eastAsia="ko-KR"/>
               </w:rPr>
@@ -215,7 +267,15 @@
             <w:vAlign w:val="center"/>
           </w:tcPr>
           <w:p>
+            <w:pPr>
+              <w:spacing w:before="40" w:after="60" w:line="276" w:lineRule="auto"/>
+            </w:pPr>
             <w:r>
+              <w:rPr>
+                <w:rFonts w:ascii="Malgun Gothic" w:hAnsi="Malgun Gothic" w:eastAsia="Malgun Gothic"/>
+                <w:color w:val="000000"/>
+                <w:sz w:val="22"/>
+              </w:rPr>
               <w:t>{{standard}}</w:t>
             </w:r>
           </w:p>
@@ -223,16 +283,24 @@
       </w:tr>
       <w:tr>
         <w:trPr>
-          <w:trHeight w:val="331"/>
+          <w:cantSplit/>
         </w:trPr>
         <w:tc>
           <w:tcPr>
             <w:tcW w:w="1844" w:type="dxa"/>
-            <w:shd w:val="clear" w:color="auto" w:fill="D9D9D9" w:themeFill="background1" w:themeFillShade="D9"/>
+            <w:shd w:val="clear" w:color="auto" w:fill="F2F4F7" w:themeFill="background1" w:themeFillShade="D9"/>
             <w:vAlign w:val="center"/>
           </w:tcPr>
           <w:p>
+            <w:pPr>
+              <w:spacing w:before="40" w:after="60" w:line="276" w:lineRule="auto"/>
+            </w:pPr>
             <w:r>
+              <w:rPr>
+                <w:rFonts w:ascii="Malgun Gothic" w:hAnsi="Malgun Gothic" w:eastAsia="Malgun Gothic"/>
+                <w:color w:val="000000"/>
+                <w:sz w:val="22"/>
+              </w:rPr>
               <w:t>Grade</w:t>
               <w:br/>
               <w:t>{{grade}}</w:t>
@@ -267,6 +335,7 @@
               </w:tcPr>
               <w:p>
                 <w:pPr>
+                  <w:spacing w:before="40" w:after="60" w:line="276" w:lineRule="auto"/>
                   <w:ind w:leftChars="72" w:left="173"/>
                   <w:rPr>
                     <w:sz w:val="20"/>
@@ -276,24 +345,36 @@
                 <w:r>
                   <w:rPr>
                     <w:rStyle w:val="aa"/>
+                    <w:rFonts w:ascii="Malgun Gothic" w:hAnsi="Malgun Gothic" w:eastAsia="Malgun Gothic"/>
+                    <w:color w:val="000000"/>
+                    <w:sz w:val="22"/>
                   </w:rPr>
                   <w:t>항목을</w:t>
                 </w:r>
                 <w:r>
                   <w:rPr>
                     <w:rStyle w:val="aa"/>
+                    <w:rFonts w:ascii="Malgun Gothic" w:hAnsi="Malgun Gothic" w:eastAsia="Malgun Gothic"/>
+                    <w:color w:val="000000"/>
+                    <w:sz w:val="22"/>
                   </w:rPr>
                   <w:t xml:space="preserve"> </w:t>
                 </w:r>
                 <w:r>
                   <w:rPr>
                     <w:rStyle w:val="aa"/>
+                    <w:rFonts w:ascii="Malgun Gothic" w:hAnsi="Malgun Gothic" w:eastAsia="Malgun Gothic"/>
+                    <w:color w:val="000000"/>
+                    <w:sz w:val="22"/>
                   </w:rPr>
                   <w:t>선택하세요</w:t>
                 </w:r>
                 <w:r>
                   <w:rPr>
                     <w:rStyle w:val="aa"/>
+                    <w:rFonts w:ascii="Malgun Gothic" w:hAnsi="Malgun Gothic" w:eastAsia="Malgun Gothic"/>
+                    <w:color w:val="000000"/>
+                    <w:sz w:val="22"/>
                   </w:rPr>
                   <w:t>.</w:t>
                 </w:r>
@@ -305,6 +386,7 @@
     </w:tbl>
     <w:p>
       <w:pPr>
+        <w:spacing w:before="40" w:after="60" w:line="276" w:lineRule="auto"/>
         <w:rPr>
           <w:lang w:eastAsia="ko-KR"/>
         </w:rPr>
@@ -312,7 +394,7 @@
     </w:p>
     <w:p>
       <w:pPr>
-        <w:spacing w:line="276" w:lineRule="auto"/>
+        <w:spacing w:line="276" w:lineRule="auto" w:before="40" w:after="60"/>
         <w:rPr>
           <w:lang w:val="en-GB" w:eastAsia="ko-KR"/>
         </w:rPr>
@@ -325,6 +407,7 @@
           <w:ilvl w:val="0"/>
           <w:numId w:val="83"/>
         </w:numPr>
+        <w:spacing w:before="40" w:after="60" w:line="276" w:lineRule="auto"/>
         <w:ind w:leftChars="0"/>
         <w:rPr>
           <w:b/>
@@ -333,72 +416,90 @@
       </w:pPr>
       <w:r>
         <w:rPr>
-          <w:rFonts w:hint="eastAsia"/>
+          <w:rFonts w:hint="eastAsia" w:ascii="Malgun Gothic" w:hAnsi="Malgun Gothic" w:eastAsia="Malgun Gothic"/>
           <w:b/>
+          <w:color w:val="000000"/>
+          <w:sz w:val="22"/>
           <w:lang w:eastAsia="ko-KR"/>
         </w:rPr>
         <w:t>개인인증</w:t>
       </w:r>
       <w:r>
         <w:rPr>
-          <w:rFonts w:hint="eastAsia"/>
+          <w:rFonts w:hint="eastAsia" w:ascii="Malgun Gothic" w:hAnsi="Malgun Gothic" w:eastAsia="Malgun Gothic"/>
           <w:b/>
+          <w:color w:val="000000"/>
+          <w:sz w:val="22"/>
           <w:lang w:eastAsia="ko-KR"/>
         </w:rPr>
         <w:t xml:space="preserve"> </w:t>
       </w:r>
       <w:r>
         <w:rPr>
-          <w:rFonts w:hint="eastAsia"/>
+          <w:rFonts w:hint="eastAsia" w:ascii="Malgun Gothic" w:hAnsi="Malgun Gothic" w:eastAsia="Malgun Gothic"/>
           <w:b/>
+          <w:color w:val="000000"/>
+          <w:sz w:val="22"/>
           <w:lang w:eastAsia="ko-KR"/>
         </w:rPr>
         <w:t>문서</w:t>
       </w:r>
       <w:r>
         <w:rPr>
-          <w:rFonts w:hint="eastAsia"/>
+          <w:rFonts w:hint="eastAsia" w:ascii="Malgun Gothic" w:hAnsi="Malgun Gothic" w:eastAsia="Malgun Gothic"/>
           <w:b/>
+          <w:color w:val="000000"/>
+          <w:sz w:val="22"/>
           <w:lang w:eastAsia="ko-KR"/>
         </w:rPr>
         <w:t xml:space="preserve"> </w:t>
       </w:r>
       <w:r>
         <w:rPr>
-          <w:rFonts w:hint="eastAsia"/>
+          <w:rFonts w:hint="eastAsia" w:ascii="Malgun Gothic" w:hAnsi="Malgun Gothic" w:eastAsia="Malgun Gothic"/>
           <w:b/>
+          <w:color w:val="000000"/>
+          <w:sz w:val="22"/>
           <w:lang w:eastAsia="ko-KR"/>
         </w:rPr>
         <w:t>및</w:t>
       </w:r>
       <w:r>
         <w:rPr>
-          <w:rFonts w:hint="eastAsia"/>
+          <w:rFonts w:hint="eastAsia" w:ascii="Malgun Gothic" w:hAnsi="Malgun Gothic" w:eastAsia="Malgun Gothic"/>
           <w:b/>
+          <w:color w:val="000000"/>
+          <w:sz w:val="22"/>
           <w:lang w:eastAsia="ko-KR"/>
         </w:rPr>
         <w:t xml:space="preserve"> </w:t>
       </w:r>
       <w:r>
         <w:rPr>
-          <w:rFonts w:hint="eastAsia"/>
+          <w:rFonts w:hint="eastAsia" w:ascii="Malgun Gothic" w:hAnsi="Malgun Gothic" w:eastAsia="Malgun Gothic"/>
           <w:b/>
+          <w:color w:val="000000"/>
+          <w:sz w:val="22"/>
           <w:lang w:eastAsia="ko-KR"/>
         </w:rPr>
         <w:t>기록</w:t>
       </w:r>
       <w:r>
         <w:rPr>
-          <w:rFonts w:hint="eastAsia"/>
+          <w:rFonts w:hint="eastAsia" w:ascii="Malgun Gothic" w:hAnsi="Malgun Gothic" w:eastAsia="Malgun Gothic"/>
           <w:b/>
+          <w:color w:val="000000"/>
+          <w:sz w:val="22"/>
           <w:lang w:eastAsia="ko-KR"/>
         </w:rPr>
         <w:t xml:space="preserve"> </w:t>
       </w:r>
       <w:r>
         <w:rPr>
-          <w:rFonts w:hint="eastAsia"/>
+          <w:rFonts w:hint="eastAsia" w:ascii="Malgun Gothic" w:hAnsi="Malgun Gothic" w:eastAsia="Malgun Gothic"/>
           <w:b/>
+          <w:color w:val="000000"/>
+          <w:sz w:val="22"/>
           <w:lang w:eastAsia="ko-KR"/>
         </w:rPr>
         <w:t>평가</w:t>
@@ -406,7 +507,7 @@
     </w:p>
     <w:p>
       <w:pPr>
-        <w:spacing w:line="276" w:lineRule="auto"/>
+        <w:spacing w:line="276" w:lineRule="auto" w:before="40" w:after="60"/>
         <w:rPr>
           <w:lang w:val="en-GB" w:eastAsia="ko-KR"/>
         </w:rPr>
@@ -418,12 +519,29 @@
         <w:tblW w:w="0" w:type="auto"/>
         <w:tblInd w:w="421" w:type="dxa"/>
         <w:tblLook w:val="04A0" w:firstRow="1" w:lastRow="0" w:firstColumn="1" w:lastColumn="0" w:noHBand="0" w:noVBand="1"/>
+        <w:tblBorders>
+          <w:top w:val="single" w:sz="4" w:color="D9D9D9"/>
+          <w:left w:val="single" w:sz="4" w:color="D9D9D9"/>
+          <w:bottom w:val="single" w:sz="4" w:color="D9D9D9"/>
+          <w:right w:val="single" w:sz="4" w:color="D9D9D9"/>
+          <w:insideH w:val="single" w:sz="4" w:color="D9D9D9"/>
+          <w:insideV w:val="single" w:sz="4" w:color="D9D9D9"/>
+        </w:tblBorders>
+        <w:tblCellMar>
+          <w:top w:w="75" w:type="dxa"/>
+          <w:bottom w:w="75" w:type="dxa"/>
+          <w:left w:w="100" w:type="dxa"/>
+          <w:right w:w="100" w:type="dxa"/>
+        </w:tblCellMar>
       </w:tblPr>
       <w:tblGrid>
         <w:gridCol w:w="708"/>
         <w:gridCol w:w="8499"/>
       </w:tblGrid>
       <w:tr>
+        <w:trPr>
+          <w:cantSplit/>
+        </w:trPr>
         <w:sdt>
           <w:sdtPr>
             <w:rPr>
@@ -447,6 +565,7 @@
               </w:tcPr>
               <w:p>
                 <w:pPr>
+                  <w:spacing w:before="40" w:after="60" w:line="276" w:lineRule="auto"/>
                   <w:jc w:val="center"/>
                   <w:rPr>
                     <w:sz w:val="22"/>
@@ -455,7 +574,8 @@
                 </w:pPr>
                 <w:r>
                   <w:rPr>
-                    <w:rFonts w:ascii="MS Gothic" w:eastAsia="MS Gothic" w:hAnsi="MS Gothic" w:hint="eastAsia"/>
+                    <w:rFonts w:ascii="Malgun Gothic" w:eastAsia="Malgun Gothic" w:hAnsi="Malgun Gothic" w:hint="eastAsia"/>
+                    <w:color w:val="000000"/>
                     <w:sz w:val="22"/>
                     <w:lang w:eastAsia="ko-KR"/>
                   </w:rPr>
@@ -469,9 +589,18 @@
           <w:tcPr>
             <w:tcW w:w="8499" w:type="dxa"/>
             <w:shd w:val="clear" w:color="auto" w:fill="auto"/>
+            <w:vAlign w:val="center"/>
           </w:tcPr>
           <w:p>
+            <w:pPr>
+              <w:spacing w:before="40" w:after="60" w:line="276" w:lineRule="auto"/>
+            </w:pPr>
             <w:r>
+              <w:rPr>
+                <w:rFonts w:ascii="Malgun Gothic" w:hAnsi="Malgun Gothic" w:eastAsia="Malgun Gothic"/>
+                <w:color w:val="000000"/>
+                <w:sz w:val="22"/>
+              </w:rPr>
               <w:t>지식 시험 합격</w:t>
               <w:br/>
               <w:t>결과: {{knowledge}}</w:t>
@@ -480,6 +609,9 @@
         </w:tc>
       </w:tr>
       <w:tr>
+        <w:trPr>
+          <w:cantSplit/>
+        </w:trPr>
         <w:sdt>
           <w:sdtPr>
             <w:rPr>
@@ -503,6 +635,7 @@
               </w:tcPr>
               <w:p>
                 <w:pPr>
+                  <w:spacing w:before="40" w:after="60" w:line="276" w:lineRule="auto"/>
                   <w:jc w:val="center"/>
                   <w:rPr>
                     <w:sz w:val="22"/>
@@ -511,7 +644,8 @@
                 </w:pPr>
                 <w:r>
                   <w:rPr>
-                    <w:rFonts w:ascii="MS Gothic" w:eastAsia="MS Gothic" w:hAnsi="MS Gothic" w:hint="eastAsia"/>
+                    <w:rFonts w:ascii="Malgun Gothic" w:eastAsia="Malgun Gothic" w:hAnsi="Malgun Gothic" w:hint="eastAsia"/>
+                    <w:color w:val="000000"/>
                     <w:sz w:val="22"/>
                     <w:lang w:eastAsia="ko-KR"/>
                   </w:rPr>
@@ -525,9 +659,18 @@
           <w:tcPr>
             <w:tcW w:w="8499" w:type="dxa"/>
             <w:shd w:val="clear" w:color="auto" w:fill="auto"/>
+            <w:vAlign w:val="center"/>
           </w:tcPr>
           <w:p>
+            <w:pPr>
+              <w:spacing w:before="40" w:after="60" w:line="276" w:lineRule="auto"/>
+            </w:pPr>
             <w:r>
+              <w:rPr>
+                <w:rFonts w:ascii="Malgun Gothic" w:hAnsi="Malgun Gothic" w:eastAsia="Malgun Gothic"/>
+                <w:color w:val="000000"/>
+                <w:sz w:val="22"/>
+              </w:rPr>
               <w:t>인성 시험 합격</w:t>
               <w:br/>
               <w:t>결과: {{personality}}</w:t>
@@ -536,6 +679,9 @@
         </w:tc>
       </w:tr>
       <w:tr>
+        <w:trPr>
+          <w:cantSplit/>
+        </w:trPr>
         <w:sdt>
           <w:sdtPr>
             <w:rPr>
@@ -559,6 +705,7 @@
               </w:tcPr>
               <w:p>
                 <w:pPr>
+                  <w:spacing w:before="40" w:after="60" w:line="276" w:lineRule="auto"/>
                   <w:jc w:val="center"/>
                   <w:rPr>
                     <w:sz w:val="22"/>
@@ -567,7 +714,8 @@
                 </w:pPr>
                 <w:r>
                   <w:rPr>
-                    <w:rFonts w:ascii="MS Gothic" w:eastAsia="MS Gothic" w:hAnsi="MS Gothic" w:hint="eastAsia"/>
+                    <w:rFonts w:ascii="Malgun Gothic" w:eastAsia="Malgun Gothic" w:hAnsi="Malgun Gothic" w:hint="eastAsia"/>
+                    <w:color w:val="000000"/>
                     <w:sz w:val="22"/>
                     <w:lang w:eastAsia="ko-KR"/>
                   </w:rPr>
@@ -581,9 +729,18 @@
           <w:tcPr>
             <w:tcW w:w="8499" w:type="dxa"/>
             <w:shd w:val="clear" w:color="auto" w:fill="auto"/>
+            <w:vAlign w:val="center"/>
           </w:tcPr>
           <w:p>
+            <w:pPr>
+              <w:spacing w:before="40" w:after="60" w:line="276" w:lineRule="auto"/>
+            </w:pPr>
             <w:r>
+              <w:rPr>
+                <w:rFonts w:ascii="Malgun Gothic" w:hAnsi="Malgun Gothic" w:eastAsia="Malgun Gothic"/>
+                <w:color w:val="000000"/>
+                <w:sz w:val="22"/>
+              </w:rPr>
               <w:t>교육 요구사항 충족</w:t>
               <w:br/>
               <w:t>결과: {{education}}</w:t>
@@ -593,7 +750,7 @@
       </w:tr>
       <w:tr>
         <w:trPr>
-          <w:trHeight w:val="277"/>
+          <w:cantSplit/>
         </w:trPr>
         <w:sdt>
           <w:sdtPr>
@@ -618,6 +775,7 @@
               </w:tcPr>
               <w:p>
                 <w:pPr>
+                  <w:spacing w:before="40" w:after="60" w:line="276" w:lineRule="auto"/>
                   <w:jc w:val="center"/>
                   <w:rPr>
                     <w:sz w:val="22"/>
@@ -626,7 +784,8 @@
                 </w:pPr>
                 <w:r>
                   <w:rPr>
-                    <w:rFonts w:ascii="MS Gothic" w:eastAsia="MS Gothic" w:hAnsi="MS Gothic" w:hint="eastAsia"/>
+                    <w:rFonts w:ascii="Malgun Gothic" w:eastAsia="Malgun Gothic" w:hAnsi="Malgun Gothic" w:hint="eastAsia"/>
+                    <w:color w:val="000000"/>
                     <w:sz w:val="22"/>
                     <w:lang w:eastAsia="ko-KR"/>
                   </w:rPr>
@@ -640,9 +799,18 @@
           <w:tcPr>
             <w:tcW w:w="8499" w:type="dxa"/>
             <w:shd w:val="clear" w:color="auto" w:fill="auto"/>
+            <w:vAlign w:val="center"/>
           </w:tcPr>
           <w:p>
+            <w:pPr>
+              <w:spacing w:before="40" w:after="60" w:line="276" w:lineRule="auto"/>
+            </w:pPr>
             <w:r>
+              <w:rPr>
+                <w:rFonts w:ascii="Malgun Gothic" w:hAnsi="Malgun Gothic" w:eastAsia="Malgun Gothic"/>
+                <w:color w:val="000000"/>
+                <w:sz w:val="22"/>
+              </w:rPr>
               <w:t>학력 및 관련 업무경력 요건 충족</w:t>
               <w:br/>
               <w:t>결과: {{academic}}</w:t>
@@ -652,7 +820,7 @@
       </w:tr>
       <w:tr>
         <w:trPr>
-          <w:trHeight w:val="277"/>
+          <w:cantSplit/>
         </w:trPr>
         <w:sdt>
           <w:sdtPr>
@@ -677,6 +845,7 @@
               </w:tcPr>
               <w:p>
                 <w:pPr>
+                  <w:spacing w:before="40" w:after="60" w:line="276" w:lineRule="auto"/>
                   <w:jc w:val="center"/>
                   <w:rPr>
                     <w:sz w:val="22"/>
@@ -685,7 +854,8 @@
                 </w:pPr>
                 <w:r>
                   <w:rPr>
-                    <w:rFonts w:ascii="MS Gothic" w:eastAsia="MS Gothic" w:hAnsi="MS Gothic" w:hint="eastAsia"/>
+                    <w:rFonts w:ascii="Malgun Gothic" w:eastAsia="Malgun Gothic" w:hAnsi="Malgun Gothic" w:hint="eastAsia"/>
+                    <w:color w:val="000000"/>
                     <w:sz w:val="22"/>
                     <w:lang w:eastAsia="ko-KR"/>
                   </w:rPr>
@@ -699,9 +869,18 @@
           <w:tcPr>
             <w:tcW w:w="8499" w:type="dxa"/>
             <w:shd w:val="clear" w:color="auto" w:fill="auto"/>
+            <w:vAlign w:val="center"/>
           </w:tcPr>
           <w:p>
+            <w:pPr>
+              <w:spacing w:before="40" w:after="60" w:line="276" w:lineRule="auto"/>
+            </w:pPr>
             <w:r>
+              <w:rPr>
+                <w:rFonts w:ascii="Malgun Gothic" w:hAnsi="Malgun Gothic" w:eastAsia="Malgun Gothic"/>
+                <w:color w:val="000000"/>
+                <w:sz w:val="22"/>
+              </w:rPr>
               <w:t>해당 규격, 또는 해당 규격에 상응하는 종류의 인증 심사경력 충족</w:t>
               <w:br/>
               <w:t>결과: {{auditExperience}}</w:t>
@@ -711,17 +890,25 @@
       </w:tr>
       <w:tr>
         <w:trPr>
-          <w:trHeight w:val="277"/>
+          <w:cantSplit/>
         </w:trPr>
         <w:tc>
           <w:tcPr>
             <w:tcW w:w="9207" w:type="dxa"/>
             <w:gridSpan w:val="2"/>
-            <w:shd w:val="clear" w:color="auto" w:fill="D9D9D9" w:themeFill="background1" w:themeFillShade="D9"/>
+            <w:shd w:val="clear" w:color="auto" w:fill="F2F4F7" w:themeFill="background1" w:themeFillShade="D9"/>
             <w:vAlign w:val="center"/>
           </w:tcPr>
           <w:p>
+            <w:pPr>
+              <w:spacing w:before="40" w:after="60" w:line="276" w:lineRule="auto"/>
+            </w:pPr>
             <w:r>
+              <w:rPr>
+                <w:rFonts w:ascii="Malgun Gothic" w:hAnsi="Malgun Gothic" w:eastAsia="Malgun Gothic"/>
+                <w:color w:val="000000"/>
+                <w:sz w:val="22"/>
+              </w:rPr>
               <w:t>검토 의견</w:t>
               <w:br/>
               <w:t>{{assessmentComment}}</w:t>
@@ -731,7 +918,7 @@
       </w:tr>
       <w:tr>
         <w:trPr>
-          <w:trHeight w:val="1601"/>
+          <w:cantSplit/>
         </w:trPr>
         <w:tc>
           <w:tcPr>
@@ -742,7 +929,7 @@
           </w:tcPr>
           <w:p>
             <w:pPr>
-              <w:spacing w:line="276" w:lineRule="auto"/>
+              <w:spacing w:line="276" w:lineRule="auto" w:before="40" w:after="60"/>
               <w:rPr>
                 <w:sz w:val="22"/>
                 <w:lang w:val="en-GB" w:eastAsia="ko-KR"/>
@@ -750,7 +937,8 @@
             </w:pPr>
             <w:r>
               <w:rPr>
-                <w:rFonts w:hint="eastAsia"/>
+                <w:rFonts w:hint="eastAsia" w:ascii="Malgun Gothic" w:hAnsi="Malgun Gothic" w:eastAsia="Malgun Gothic"/>
+                <w:color w:val="000000"/>
                 <w:sz w:val="22"/>
                 <w:lang w:val="en-GB" w:eastAsia="ko-KR"/>
               </w:rPr>
@@ -758,7 +946,8 @@
             </w:r>
             <w:r>
               <w:rPr>
-                <w:rFonts w:hint="eastAsia"/>
+                <w:rFonts w:hint="eastAsia" w:ascii="Malgun Gothic" w:hAnsi="Malgun Gothic" w:eastAsia="Malgun Gothic"/>
+                <w:color w:val="000000"/>
                 <w:sz w:val="22"/>
                 <w:lang w:val="en-GB" w:eastAsia="ko-KR"/>
               </w:rPr>
@@ -766,7 +955,8 @@
             </w:r>
             <w:r>
               <w:rPr>
-                <w:rFonts w:hint="eastAsia"/>
+                <w:rFonts w:hint="eastAsia" w:ascii="Malgun Gothic" w:hAnsi="Malgun Gothic" w:eastAsia="Malgun Gothic"/>
+                <w:color w:val="000000"/>
                 <w:sz w:val="22"/>
                 <w:lang w:val="en-GB" w:eastAsia="ko-KR"/>
               </w:rPr>
@@ -774,7 +964,8 @@
             </w:r>
             <w:r>
               <w:rPr>
-                <w:rFonts w:hint="eastAsia"/>
+                <w:rFonts w:hint="eastAsia" w:ascii="Malgun Gothic" w:hAnsi="Malgun Gothic" w:eastAsia="Malgun Gothic"/>
+                <w:color w:val="000000"/>
                 <w:sz w:val="22"/>
                 <w:lang w:val="en-GB" w:eastAsia="ko-KR"/>
               </w:rPr>
@@ -782,7 +973,8 @@
             </w:r>
             <w:r>
               <w:rPr>
-                <w:rFonts w:hint="eastAsia"/>
+                <w:rFonts w:hint="eastAsia" w:ascii="Malgun Gothic" w:hAnsi="Malgun Gothic" w:eastAsia="Malgun Gothic"/>
+                <w:color w:val="000000"/>
                 <w:sz w:val="22"/>
                 <w:lang w:val="en-GB" w:eastAsia="ko-KR"/>
               </w:rPr>
@@ -790,7 +982,8 @@
             </w:r>
             <w:r>
               <w:rPr>
-                <w:rFonts w:hint="eastAsia"/>
+                <w:rFonts w:hint="eastAsia" w:ascii="Malgun Gothic" w:hAnsi="Malgun Gothic" w:eastAsia="Malgun Gothic"/>
+                <w:color w:val="000000"/>
                 <w:sz w:val="22"/>
                 <w:lang w:val="en-GB" w:eastAsia="ko-KR"/>
               </w:rPr>
@@ -798,7 +991,8 @@
             </w:r>
             <w:r>
               <w:rPr>
-                <w:rFonts w:hint="eastAsia"/>
+                <w:rFonts w:hint="eastAsia" w:ascii="Malgun Gothic" w:hAnsi="Malgun Gothic" w:eastAsia="Malgun Gothic"/>
+                <w:color w:val="000000"/>
                 <w:sz w:val="22"/>
                 <w:lang w:val="en-GB" w:eastAsia="ko-KR"/>
               </w:rPr>
@@ -806,7 +1000,8 @@
             </w:r>
             <w:r>
               <w:rPr>
-                <w:rFonts w:hint="eastAsia"/>
+                <w:rFonts w:hint="eastAsia" w:ascii="Malgun Gothic" w:hAnsi="Malgun Gothic" w:eastAsia="Malgun Gothic"/>
+                <w:color w:val="000000"/>
                 <w:sz w:val="22"/>
                 <w:lang w:val="en-GB" w:eastAsia="ko-KR"/>
               </w:rPr>
@@ -814,7 +1009,8 @@
             </w:r>
             <w:r>
               <w:rPr>
-                <w:rFonts w:hint="eastAsia"/>
+                <w:rFonts w:hint="eastAsia" w:ascii="Malgun Gothic" w:hAnsi="Malgun Gothic" w:eastAsia="Malgun Gothic"/>
+                <w:color w:val="000000"/>
                 <w:sz w:val="22"/>
                 <w:lang w:val="en-GB" w:eastAsia="ko-KR"/>
               </w:rPr>
@@ -822,7 +1018,8 @@
             </w:r>
             <w:r>
               <w:rPr>
-                <w:rFonts w:hint="eastAsia"/>
+                <w:rFonts w:hint="eastAsia" w:ascii="Malgun Gothic" w:hAnsi="Malgun Gothic" w:eastAsia="Malgun Gothic"/>
+                <w:color w:val="000000"/>
                 <w:sz w:val="22"/>
                 <w:lang w:val="en-GB" w:eastAsia="ko-KR"/>
               </w:rPr>
@@ -830,6 +1027,8 @@
             </w:r>
             <w:r>
               <w:rPr>
+                <w:rFonts w:ascii="Malgun Gothic" w:hAnsi="Malgun Gothic" w:eastAsia="Malgun Gothic"/>
+                <w:color w:val="000000"/>
                 <w:sz w:val="22"/>
                 <w:lang w:val="en-GB" w:eastAsia="ko-KR"/>
               </w:rPr>
@@ -841,7 +1040,7 @@
     </w:tbl>
     <w:p>
       <w:pPr>
-        <w:spacing w:line="276" w:lineRule="auto"/>
+        <w:spacing w:line="276" w:lineRule="auto" w:before="40" w:after="60"/>
         <w:rPr>
           <w:lang w:val="en-GB" w:eastAsia="ko-KR"/>
         </w:rPr>
@@ -849,7 +1048,7 @@
     </w:p>
     <w:p>
       <w:pPr>
-        <w:spacing w:line="276" w:lineRule="auto"/>
+        <w:spacing w:line="276" w:lineRule="auto" w:before="40" w:after="60"/>
         <w:rPr>
           <w:lang w:val="en-GB" w:eastAsia="ko-KR"/>
         </w:rPr>
@@ -857,7 +1056,7 @@
     </w:p>
     <w:p>
       <w:pPr>
-        <w:spacing w:line="276" w:lineRule="auto"/>
+        <w:spacing w:line="276" w:lineRule="auto" w:before="40" w:after="60"/>
         <w:rPr>
           <w:lang w:val="en-GB" w:eastAsia="ko-KR"/>
         </w:rPr>
@@ -865,7 +1064,7 @@
     </w:p>
     <w:p>
       <w:pPr>
-        <w:spacing w:line="276" w:lineRule="auto"/>
+        <w:spacing w:line="276" w:lineRule="auto" w:before="40" w:after="60"/>
         <w:rPr>
           <w:lang w:val="en-GB" w:eastAsia="ko-KR"/>
         </w:rPr>
@@ -878,6 +1077,7 @@
           <w:ilvl w:val="0"/>
           <w:numId w:val="83"/>
         </w:numPr>
+        <w:spacing w:before="40" w:after="60" w:line="276" w:lineRule="auto"/>
         <w:ind w:leftChars="0"/>
         <w:rPr>
           <w:b/>
@@ -886,24 +1086,30 @@
       </w:pPr>
       <w:r>
         <w:rPr>
-          <w:rFonts w:hint="eastAsia"/>
+          <w:rFonts w:hint="eastAsia" w:ascii="Malgun Gothic" w:hAnsi="Malgun Gothic" w:eastAsia="Malgun Gothic"/>
           <w:b/>
+          <w:color w:val="000000"/>
+          <w:sz w:val="22"/>
           <w:lang w:eastAsia="ko-KR"/>
         </w:rPr>
         <w:t>인증패널</w:t>
       </w:r>
       <w:r>
         <w:rPr>
-          <w:rFonts w:hint="eastAsia"/>
+          <w:rFonts w:hint="eastAsia" w:ascii="Malgun Gothic" w:hAnsi="Malgun Gothic" w:eastAsia="Malgun Gothic"/>
           <w:b/>
+          <w:color w:val="000000"/>
+          <w:sz w:val="22"/>
           <w:lang w:eastAsia="ko-KR"/>
         </w:rPr>
         <w:t xml:space="preserve"> </w:t>
       </w:r>
       <w:r>
         <w:rPr>
-          <w:rFonts w:hint="eastAsia"/>
+          <w:rFonts w:hint="eastAsia" w:ascii="Malgun Gothic" w:hAnsi="Malgun Gothic" w:eastAsia="Malgun Gothic"/>
           <w:b/>
+          <w:color w:val="000000"/>
+          <w:sz w:val="22"/>
           <w:lang w:eastAsia="ko-KR"/>
         </w:rPr>
         <w:t>결정</w:t>
@@ -911,7 +1117,7 @@
     </w:p>
     <w:p>
       <w:pPr>
-        <w:spacing w:line="276" w:lineRule="auto"/>
+        <w:spacing w:line="276" w:lineRule="auto" w:before="40" w:after="60"/>
         <w:rPr>
           <w:lang w:val="en-GB" w:eastAsia="ko-KR"/>
         </w:rPr>
@@ -919,7 +1125,7 @@
     </w:p>
     <w:p>
       <w:pPr>
-        <w:spacing w:line="276" w:lineRule="auto"/>
+        <w:spacing w:line="276" w:lineRule="auto" w:before="40" w:after="60"/>
         <w:ind w:leftChars="200" w:left="480"/>
         <w:rPr>
           <w:sz w:val="22"/>
@@ -928,7 +1134,8 @@
       </w:pPr>
       <w:r>
         <w:rPr>
-          <w:rFonts w:hint="eastAsia"/>
+          <w:rFonts w:hint="eastAsia" w:ascii="Malgun Gothic" w:hAnsi="Malgun Gothic" w:eastAsia="Malgun Gothic"/>
+          <w:color w:val="000000"/>
           <w:sz w:val="22"/>
           <w:lang w:val="en-GB" w:eastAsia="ko-KR"/>
         </w:rPr>
@@ -936,7 +1143,8 @@
       </w:r>
       <w:r>
         <w:rPr>
-          <w:rFonts w:hint="eastAsia"/>
+          <w:rFonts w:hint="eastAsia" w:ascii="Malgun Gothic" w:hAnsi="Malgun Gothic" w:eastAsia="Malgun Gothic"/>
+          <w:color w:val="000000"/>
           <w:sz w:val="22"/>
           <w:lang w:val="en-GB" w:eastAsia="ko-KR"/>
         </w:rPr>
@@ -944,6 +1152,8 @@
       </w:r>
       <w:r>
         <w:rPr>
+          <w:rFonts w:ascii="Malgun Gothic" w:hAnsi="Malgun Gothic" w:eastAsia="Malgun Gothic"/>
+          <w:color w:val="000000"/>
           <w:sz w:val="22"/>
           <w:lang w:val="en-GB" w:eastAsia="ko-KR"/>
         </w:rPr>
@@ -951,6 +1161,8 @@
       </w:r>
       <w:r>
         <w:rPr>
+          <w:rFonts w:ascii="Malgun Gothic" w:hAnsi="Malgun Gothic" w:eastAsia="Malgun Gothic"/>
+          <w:color w:val="000000"/>
           <w:sz w:val="22"/>
           <w:lang w:val="en-GB" w:eastAsia="ko-KR"/>
         </w:rPr>
@@ -958,6 +1170,8 @@
       </w:r>
       <w:r>
         <w:rPr>
+          <w:rFonts w:ascii="Malgun Gothic" w:hAnsi="Malgun Gothic" w:eastAsia="Malgun Gothic"/>
+          <w:color w:val="000000"/>
           <w:sz w:val="22"/>
           <w:lang w:val="en-GB" w:eastAsia="ko-KR"/>
         </w:rPr>
@@ -965,7 +1179,8 @@
       </w:r>
       <w:r>
         <w:rPr>
-          <w:rFonts w:hint="eastAsia"/>
+          <w:rFonts w:hint="eastAsia" w:ascii="Malgun Gothic" w:hAnsi="Malgun Gothic" w:eastAsia="Malgun Gothic"/>
+          <w:color w:val="000000"/>
           <w:sz w:val="22"/>
           <w:lang w:val="en-GB" w:eastAsia="ko-KR"/>
         </w:rPr>
@@ -973,7 +1188,8 @@
       </w:r>
       <w:r>
         <w:rPr>
-          <w:rFonts w:hint="eastAsia"/>
+          <w:rFonts w:hint="eastAsia" w:ascii="Malgun Gothic" w:hAnsi="Malgun Gothic" w:eastAsia="Malgun Gothic"/>
+          <w:color w:val="000000"/>
           <w:sz w:val="22"/>
           <w:lang w:val="en-GB" w:eastAsia="ko-KR"/>
         </w:rPr>
@@ -981,7 +1197,8 @@
       </w:r>
       <w:r>
         <w:rPr>
-          <w:rFonts w:hint="eastAsia"/>
+          <w:rFonts w:hint="eastAsia" w:ascii="Malgun Gothic" w:hAnsi="Malgun Gothic" w:eastAsia="Malgun Gothic"/>
+          <w:color w:val="000000"/>
           <w:sz w:val="22"/>
           <w:lang w:val="en-GB" w:eastAsia="ko-KR"/>
         </w:rPr>
@@ -989,7 +1206,8 @@
       </w:r>
       <w:r>
         <w:rPr>
-          <w:rFonts w:hint="eastAsia"/>
+          <w:rFonts w:hint="eastAsia" w:ascii="Malgun Gothic" w:hAnsi="Malgun Gothic" w:eastAsia="Malgun Gothic"/>
+          <w:color w:val="000000"/>
           <w:sz w:val="22"/>
           <w:lang w:val="en-GB" w:eastAsia="ko-KR"/>
         </w:rPr>
@@ -997,6 +1215,8 @@
       </w:r>
       <w:r>
         <w:rPr>
+          <w:rFonts w:ascii="Malgun Gothic" w:hAnsi="Malgun Gothic" w:eastAsia="Malgun Gothic"/>
+          <w:color w:val="000000"/>
           <w:sz w:val="22"/>
           <w:lang w:val="en-GB" w:eastAsia="ko-KR"/>
         </w:rPr>
@@ -1004,7 +1224,8 @@
       </w:r>
       <w:r>
         <w:rPr>
-          <w:rFonts w:hint="eastAsia"/>
+          <w:rFonts w:hint="eastAsia" w:ascii="Malgun Gothic" w:hAnsi="Malgun Gothic" w:eastAsia="Malgun Gothic"/>
+          <w:color w:val="000000"/>
           <w:sz w:val="22"/>
           <w:lang w:val="en-GB" w:eastAsia="ko-KR"/>
         </w:rPr>
@@ -1012,7 +1233,8 @@
       </w:r>
       <w:r>
         <w:rPr>
-          <w:rFonts w:hint="eastAsia"/>
+          <w:rFonts w:hint="eastAsia" w:ascii="Malgun Gothic" w:hAnsi="Malgun Gothic" w:eastAsia="Malgun Gothic"/>
+          <w:color w:val="000000"/>
           <w:sz w:val="22"/>
           <w:lang w:val="en-GB" w:eastAsia="ko-KR"/>
         </w:rPr>
@@ -1020,7 +1242,8 @@
       </w:r>
       <w:r>
         <w:rPr>
-          <w:rFonts w:hint="eastAsia"/>
+          <w:rFonts w:hint="eastAsia" w:ascii="Malgun Gothic" w:hAnsi="Malgun Gothic" w:eastAsia="Malgun Gothic"/>
+          <w:color w:val="000000"/>
           <w:sz w:val="22"/>
           <w:lang w:val="en-GB" w:eastAsia="ko-KR"/>
         </w:rPr>
@@ -1028,7 +1251,8 @@
       </w:r>
       <w:r>
         <w:rPr>
-          <w:rFonts w:hint="eastAsia"/>
+          <w:rFonts w:hint="eastAsia" w:ascii="Malgun Gothic" w:hAnsi="Malgun Gothic" w:eastAsia="Malgun Gothic"/>
+          <w:color w:val="000000"/>
           <w:sz w:val="22"/>
           <w:lang w:val="en-GB" w:eastAsia="ko-KR"/>
         </w:rPr>
@@ -1036,7 +1260,8 @@
       </w:r>
       <w:r>
         <w:rPr>
-          <w:rFonts w:hint="eastAsia"/>
+          <w:rFonts w:hint="eastAsia" w:ascii="Malgun Gothic" w:hAnsi="Malgun Gothic" w:eastAsia="Malgun Gothic"/>
+          <w:color w:val="000000"/>
           <w:sz w:val="22"/>
           <w:lang w:val="en-GB" w:eastAsia="ko-KR"/>
         </w:rPr>
@@ -1044,7 +1269,8 @@
       </w:r>
       <w:r>
         <w:rPr>
-          <w:rFonts w:hint="eastAsia"/>
+          <w:rFonts w:hint="eastAsia" w:ascii="Malgun Gothic" w:hAnsi="Malgun Gothic" w:eastAsia="Malgun Gothic"/>
+          <w:color w:val="000000"/>
           <w:sz w:val="22"/>
           <w:lang w:val="en-GB" w:eastAsia="ko-KR"/>
         </w:rPr>
@@ -1053,7 +1279,7 @@
     </w:p>
     <w:p>
       <w:pPr>
-        <w:spacing w:line="276" w:lineRule="auto"/>
+        <w:spacing w:line="276" w:lineRule="auto" w:before="40" w:after="60"/>
         <w:ind w:leftChars="200" w:left="480"/>
         <w:rPr>
           <w:sz w:val="22"/>
@@ -1062,6 +1288,8 @@
       </w:pPr>
       <w:r>
         <w:rPr>
+          <w:rFonts w:ascii="Malgun Gothic" w:hAnsi="Malgun Gothic" w:eastAsia="Malgun Gothic"/>
+          <w:color w:val="000000"/>
           <w:sz w:val="22"/>
           <w:lang w:val="en-GB" w:eastAsia="ko-KR"/>
         </w:rPr>
@@ -1069,7 +1297,8 @@
       </w:r>
       <w:r>
         <w:rPr>
-          <w:rFonts w:hint="eastAsia"/>
+          <w:rFonts w:hint="eastAsia" w:ascii="Malgun Gothic" w:hAnsi="Malgun Gothic" w:eastAsia="Malgun Gothic"/>
+          <w:color w:val="000000"/>
           <w:sz w:val="22"/>
           <w:lang w:val="en-GB" w:eastAsia="ko-KR"/>
         </w:rPr>
@@ -1077,7 +1306,8 @@
       </w:r>
       <w:r>
         <w:rPr>
-          <w:rFonts w:hint="eastAsia"/>
+          <w:rFonts w:hint="eastAsia" w:ascii="Malgun Gothic" w:hAnsi="Malgun Gothic" w:eastAsia="Malgun Gothic"/>
+          <w:color w:val="000000"/>
           <w:sz w:val="22"/>
           <w:lang w:val="en-GB" w:eastAsia="ko-KR"/>
         </w:rPr>
@@ -1085,7 +1315,8 @@
       </w:r>
       <w:r>
         <w:rPr>
-          <w:rFonts w:hint="eastAsia"/>
+          <w:rFonts w:hint="eastAsia" w:ascii="Malgun Gothic" w:hAnsi="Malgun Gothic" w:eastAsia="Malgun Gothic"/>
+          <w:color w:val="000000"/>
           <w:sz w:val="22"/>
           <w:lang w:val="en-GB" w:eastAsia="ko-KR"/>
         </w:rPr>
@@ -1093,7 +1324,8 @@
       </w:r>
       <w:r>
         <w:rPr>
-          <w:rFonts w:hint="eastAsia"/>
+          <w:rFonts w:hint="eastAsia" w:ascii="Malgun Gothic" w:hAnsi="Malgun Gothic" w:eastAsia="Malgun Gothic"/>
+          <w:color w:val="000000"/>
           <w:sz w:val="22"/>
           <w:lang w:val="en-GB" w:eastAsia="ko-KR"/>
         </w:rPr>
@@ -1101,7 +1333,8 @@
       </w:r>
       <w:r>
         <w:rPr>
-          <w:rFonts w:hint="eastAsia"/>
+          <w:rFonts w:hint="eastAsia" w:ascii="Malgun Gothic" w:hAnsi="Malgun Gothic" w:eastAsia="Malgun Gothic"/>
+          <w:color w:val="000000"/>
           <w:sz w:val="22"/>
           <w:lang w:val="en-GB" w:eastAsia="ko-KR"/>
         </w:rPr>
@@ -1109,7 +1342,8 @@
       </w:r>
       <w:r>
         <w:rPr>
-          <w:rFonts w:hint="eastAsia"/>
+          <w:rFonts w:hint="eastAsia" w:ascii="Malgun Gothic" w:hAnsi="Malgun Gothic" w:eastAsia="Malgun Gothic"/>
+          <w:color w:val="000000"/>
           <w:sz w:val="22"/>
           <w:lang w:val="en-GB" w:eastAsia="ko-KR"/>
         </w:rPr>
@@ -1117,7 +1351,8 @@
       </w:r>
       <w:r>
         <w:rPr>
-          <w:rFonts w:hint="eastAsia"/>
+          <w:rFonts w:hint="eastAsia" w:ascii="Malgun Gothic" w:hAnsi="Malgun Gothic" w:eastAsia="Malgun Gothic"/>
+          <w:color w:val="000000"/>
           <w:sz w:val="22"/>
           <w:lang w:val="en-GB" w:eastAsia="ko-KR"/>
         </w:rPr>
@@ -1125,7 +1360,8 @@
       </w:r>
       <w:r>
         <w:rPr>
-          <w:rFonts w:hint="eastAsia"/>
+          <w:rFonts w:hint="eastAsia" w:ascii="Malgun Gothic" w:hAnsi="Malgun Gothic" w:eastAsia="Malgun Gothic"/>
+          <w:color w:val="000000"/>
           <w:sz w:val="22"/>
           <w:lang w:val="en-GB" w:eastAsia="ko-KR"/>
         </w:rPr>
@@ -1133,7 +1369,8 @@
       </w:r>
       <w:r>
         <w:rPr>
-          <w:rFonts w:hint="eastAsia"/>
+          <w:rFonts w:hint="eastAsia" w:ascii="Malgun Gothic" w:hAnsi="Malgun Gothic" w:eastAsia="Malgun Gothic"/>
+          <w:color w:val="000000"/>
           <w:sz w:val="22"/>
           <w:lang w:val="en-GB" w:eastAsia="ko-KR"/>
         </w:rPr>
@@ -1141,7 +1378,8 @@
       </w:r>
       <w:r>
         <w:rPr>
-          <w:rFonts w:hint="eastAsia"/>
+          <w:rFonts w:hint="eastAsia" w:ascii="Malgun Gothic" w:hAnsi="Malgun Gothic" w:eastAsia="Malgun Gothic"/>
+          <w:color w:val="000000"/>
           <w:sz w:val="22"/>
           <w:lang w:val="en-GB" w:eastAsia="ko-KR"/>
         </w:rPr>
@@ -1149,7 +1387,8 @@
       </w:r>
       <w:r>
         <w:rPr>
-          <w:rFonts w:hint="eastAsia"/>
+          <w:rFonts w:hint="eastAsia" w:ascii="Malgun Gothic" w:hAnsi="Malgun Gothic" w:eastAsia="Malgun Gothic"/>
+          <w:color w:val="000000"/>
           <w:sz w:val="22"/>
           <w:lang w:val="en-GB" w:eastAsia="ko-KR"/>
         </w:rPr>
@@ -1157,7 +1396,8 @@
       </w:r>
       <w:r>
         <w:rPr>
-          <w:rFonts w:hint="eastAsia"/>
+          <w:rFonts w:hint="eastAsia" w:ascii="Malgun Gothic" w:hAnsi="Malgun Gothic" w:eastAsia="Malgun Gothic"/>
+          <w:color w:val="000000"/>
           <w:sz w:val="22"/>
           <w:lang w:val="en-GB" w:eastAsia="ko-KR"/>
         </w:rPr>
@@ -1165,7 +1405,8 @@
       </w:r>
       <w:r>
         <w:rPr>
-          <w:rFonts w:hint="eastAsia"/>
+          <w:rFonts w:hint="eastAsia" w:ascii="Malgun Gothic" w:hAnsi="Malgun Gothic" w:eastAsia="Malgun Gothic"/>
+          <w:color w:val="000000"/>
           <w:sz w:val="22"/>
           <w:lang w:val="en-GB" w:eastAsia="ko-KR"/>
         </w:rPr>
@@ -1173,7 +1414,8 @@
       </w:r>
       <w:r>
         <w:rPr>
-          <w:rFonts w:hint="eastAsia"/>
+          <w:rFonts w:hint="eastAsia" w:ascii="Malgun Gothic" w:hAnsi="Malgun Gothic" w:eastAsia="Malgun Gothic"/>
+          <w:color w:val="000000"/>
           <w:sz w:val="22"/>
           <w:lang w:val="en-GB" w:eastAsia="ko-KR"/>
         </w:rPr>
@@ -1182,7 +1424,7 @@
     </w:p>
     <w:p>
       <w:pPr>
-        <w:spacing w:line="276" w:lineRule="auto"/>
+        <w:spacing w:line="276" w:lineRule="auto" w:before="40" w:after="60"/>
         <w:rPr>
           <w:lang w:val="en-GB" w:eastAsia="ko-KR"/>
         </w:rPr>
@@ -1194,14 +1436,20 @@
         <w:tblW w:w="9208" w:type="dxa"/>
         <w:tblInd w:w="426" w:type="dxa"/>
         <w:tblBorders>
-          <w:top w:val="none" w:sz="0" w:space="0" w:color="auto"/>
-          <w:left w:val="none" w:sz="0" w:space="0" w:color="auto"/>
-          <w:bottom w:val="none" w:sz="0" w:space="0" w:color="auto"/>
-          <w:right w:val="none" w:sz="0" w:space="0" w:color="auto"/>
-          <w:insideH w:val="none" w:sz="0" w:space="0" w:color="auto"/>
-          <w:insideV w:val="none" w:sz="0" w:space="0" w:color="auto"/>
+          <w:top w:val="single" w:sz="4" w:space="0" w:color="D9D9D9"/>
+          <w:left w:val="single" w:sz="4" w:space="0" w:color="D9D9D9"/>
+          <w:bottom w:val="single" w:sz="4" w:space="0" w:color="D9D9D9"/>
+          <w:right w:val="single" w:sz="4" w:space="0" w:color="D9D9D9"/>
+          <w:insideH w:val="single" w:sz="4" w:space="0" w:color="D9D9D9"/>
+          <w:insideV w:val="single" w:sz="4" w:space="0" w:color="D9D9D9"/>
         </w:tblBorders>
         <w:tblLook w:val="04A0" w:firstRow="1" w:lastRow="0" w:firstColumn="1" w:lastColumn="0" w:noHBand="0" w:noVBand="1"/>
+        <w:tblCellMar>
+          <w:top w:w="75" w:type="dxa"/>
+          <w:bottom w:w="75" w:type="dxa"/>
+          <w:left w:w="100" w:type="dxa"/>
+          <w:right w:w="100" w:type="dxa"/>
+        </w:tblCellMar>
       </w:tblPr>
       <w:tblGrid>
         <w:gridCol w:w="2693"/>
@@ -1209,12 +1457,24 @@
         <w:gridCol w:w="3070"/>
       </w:tblGrid>
       <w:tr>
+        <w:trPr>
+          <w:cantSplit/>
+        </w:trPr>
         <w:tc>
           <w:tcPr>
             <w:tcW w:w="2693" w:type="dxa"/>
+            <w:vAlign w:val="center"/>
           </w:tcPr>
           <w:p>
+            <w:pPr>
+              <w:spacing w:before="40" w:after="60" w:line="276" w:lineRule="auto"/>
+            </w:pPr>
             <w:r>
+              <w:rPr>
+                <w:rFonts w:ascii="Malgun Gothic" w:hAnsi="Malgun Gothic" w:eastAsia="Malgun Gothic"/>
+                <w:color w:val="000000"/>
+                <w:sz w:val="22"/>
+              </w:rPr>
               <w:t>인증 승인 {{approveMark}}</w:t>
             </w:r>
           </w:p>
@@ -1222,9 +1482,18 @@
         <w:tc>
           <w:tcPr>
             <w:tcW w:w="3445" w:type="dxa"/>
+            <w:vAlign w:val="center"/>
           </w:tcPr>
           <w:p>
+            <w:pPr>
+              <w:spacing w:before="40" w:after="60" w:line="276" w:lineRule="auto"/>
+            </w:pPr>
             <w:r>
+              <w:rPr>
+                <w:rFonts w:ascii="Malgun Gothic" w:hAnsi="Malgun Gothic" w:eastAsia="Malgun Gothic"/>
+                <w:color w:val="000000"/>
+                <w:sz w:val="22"/>
+              </w:rPr>
               <w:t>인증 불승인 {{rejectMark}}</w:t>
             </w:r>
           </w:p>
@@ -1232,9 +1501,18 @@
         <w:tc>
           <w:tcPr>
             <w:tcW w:w="3070" w:type="dxa"/>
+            <w:vAlign w:val="center"/>
           </w:tcPr>
           <w:p>
+            <w:pPr>
+              <w:spacing w:before="40" w:after="60" w:line="276" w:lineRule="auto"/>
+            </w:pPr>
             <w:r>
+              <w:rPr>
+                <w:rFonts w:ascii="Malgun Gothic" w:hAnsi="Malgun Gothic" w:eastAsia="Malgun Gothic"/>
+                <w:color w:val="000000"/>
+                <w:sz w:val="22"/>
+              </w:rPr>
               <w:t>재승인 {{reapproveMark}}</w:t>
             </w:r>
           </w:p>
@@ -1243,7 +1521,7 @@
     </w:tbl>
     <w:p>
       <w:pPr>
-        <w:spacing w:line="276" w:lineRule="auto"/>
+        <w:spacing w:line="276" w:lineRule="auto" w:before="40" w:after="60"/>
         <w:rPr>
           <w:sz w:val="22"/>
           <w:lang w:val="en-GB" w:eastAsia="ko-KR"/>
@@ -1252,7 +1530,7 @@
     </w:p>
     <w:p>
       <w:pPr>
-        <w:spacing w:line="276" w:lineRule="auto"/>
+        <w:spacing w:line="276" w:lineRule="auto" w:before="40" w:after="60"/>
         <w:ind w:leftChars="236" w:left="566"/>
         <w:rPr>
           <w:sz w:val="22"/>
@@ -1260,12 +1538,17 @@
         </w:rPr>
       </w:pPr>
       <w:r>
+        <w:rPr>
+          <w:rFonts w:ascii="Malgun Gothic" w:hAnsi="Malgun Gothic" w:eastAsia="Malgun Gothic"/>
+          <w:color w:val="000000"/>
+          <w:sz w:val="22"/>
+        </w:rPr>
         <w:t>인증 번호: {{certificationNo}}</w:t>
       </w:r>
     </w:p>
     <w:p>
       <w:pPr>
-        <w:spacing w:line="276" w:lineRule="auto"/>
+        <w:spacing w:line="276" w:lineRule="auto" w:before="40" w:after="60"/>
         <w:ind w:leftChars="236" w:left="566"/>
         <w:rPr>
           <w:sz w:val="22"/>
@@ -1273,12 +1556,17 @@
         </w:rPr>
       </w:pPr>
       <w:r>
+        <w:rPr>
+          <w:rFonts w:ascii="Malgun Gothic" w:hAnsi="Malgun Gothic" w:eastAsia="Malgun Gothic"/>
+          <w:color w:val="000000"/>
+          <w:sz w:val="22"/>
+        </w:rPr>
         <w:t>유효 기간: {{validityPeriod}}</w:t>
       </w:r>
     </w:p>
     <w:p>
       <w:pPr>
-        <w:spacing w:line="276" w:lineRule="auto"/>
+        <w:spacing w:line="276" w:lineRule="auto" w:before="40" w:after="60"/>
         <w:rPr>
           <w:sz w:val="22"/>
           <w:lang w:val="en-GB" w:eastAsia="ko-KR"/>
@@ -1287,7 +1575,7 @@
     </w:p>
     <w:p>
       <w:pPr>
-        <w:spacing w:line="276" w:lineRule="auto"/>
+        <w:spacing w:line="276" w:lineRule="auto" w:before="40" w:after="60"/>
         <w:rPr>
           <w:sz w:val="22"/>
           <w:lang w:val="en-GB" w:eastAsia="ko-KR"/>
@@ -1301,6 +1589,7 @@
           <w:ilvl w:val="0"/>
           <w:numId w:val="83"/>
         </w:numPr>
+        <w:spacing w:before="40" w:after="60" w:line="276" w:lineRule="auto"/>
         <w:ind w:leftChars="0"/>
         <w:rPr>
           <w:b/>
@@ -1309,24 +1598,30 @@
       </w:pPr>
       <w:r>
         <w:rPr>
-          <w:rFonts w:hint="eastAsia"/>
+          <w:rFonts w:hint="eastAsia" w:ascii="Malgun Gothic" w:hAnsi="Malgun Gothic" w:eastAsia="Malgun Gothic"/>
           <w:b/>
+          <w:color w:val="000000"/>
+          <w:sz w:val="22"/>
           <w:lang w:eastAsia="ko-KR"/>
         </w:rPr>
         <w:t>인증원</w:t>
       </w:r>
       <w:r>
         <w:rPr>
-          <w:rFonts w:hint="eastAsia"/>
+          <w:rFonts w:hint="eastAsia" w:ascii="Malgun Gothic" w:hAnsi="Malgun Gothic" w:eastAsia="Malgun Gothic"/>
           <w:b/>
+          <w:color w:val="000000"/>
+          <w:sz w:val="22"/>
           <w:lang w:eastAsia="ko-KR"/>
         </w:rPr>
         <w:t xml:space="preserve"> </w:t>
       </w:r>
       <w:r>
         <w:rPr>
-          <w:rFonts w:hint="eastAsia"/>
+          <w:rFonts w:hint="eastAsia" w:ascii="Malgun Gothic" w:hAnsi="Malgun Gothic" w:eastAsia="Malgun Gothic"/>
           <w:b/>
+          <w:color w:val="000000"/>
+          <w:sz w:val="22"/>
           <w:lang w:eastAsia="ko-KR"/>
         </w:rPr>
         <w:t>평가</w:t>
@@ -1334,7 +1629,7 @@
     </w:p>
     <w:p>
       <w:pPr>
-        <w:spacing w:line="276" w:lineRule="auto"/>
+        <w:spacing w:line="276" w:lineRule="auto" w:before="40" w:after="60"/>
         <w:rPr>
           <w:sz w:val="22"/>
           <w:lang w:val="en-GB" w:eastAsia="ko-KR"/>
@@ -1348,7 +1643,7 @@
           <w:ilvl w:val="0"/>
           <w:numId w:val="84"/>
         </w:numPr>
-        <w:spacing w:line="276" w:lineRule="auto"/>
+        <w:spacing w:line="276" w:lineRule="auto" w:before="40" w:after="60"/>
         <w:ind w:leftChars="0"/>
         <w:rPr>
           <w:sz w:val="22"/>
@@ -1357,7 +1652,8 @@
       </w:pPr>
       <w:r>
         <w:rPr>
-          <w:rFonts w:hint="eastAsia"/>
+          <w:rFonts w:hint="eastAsia" w:ascii="Malgun Gothic" w:hAnsi="Malgun Gothic" w:eastAsia="Malgun Gothic"/>
+          <w:color w:val="000000"/>
           <w:sz w:val="22"/>
           <w:lang w:val="en-GB" w:eastAsia="ko-KR"/>
         </w:rPr>
@@ -1365,7 +1661,8 @@
       </w:r>
       <w:r>
         <w:rPr>
-          <w:rFonts w:hint="eastAsia"/>
+          <w:rFonts w:hint="eastAsia" w:ascii="Malgun Gothic" w:hAnsi="Malgun Gothic" w:eastAsia="Malgun Gothic"/>
+          <w:color w:val="000000"/>
           <w:sz w:val="22"/>
           <w:lang w:val="en-GB" w:eastAsia="ko-KR"/>
         </w:rPr>
@@ -1373,7 +1670,8 @@
       </w:r>
       <w:r>
         <w:rPr>
-          <w:rFonts w:hint="eastAsia"/>
+          <w:rFonts w:hint="eastAsia" w:ascii="Malgun Gothic" w:hAnsi="Malgun Gothic" w:eastAsia="Malgun Gothic"/>
+          <w:color w:val="000000"/>
           <w:sz w:val="22"/>
           <w:lang w:val="en-GB" w:eastAsia="ko-KR"/>
         </w:rPr>
@@ -1381,7 +1679,8 @@
       </w:r>
       <w:r>
         <w:rPr>
-          <w:rFonts w:hint="eastAsia"/>
+          <w:rFonts w:hint="eastAsia" w:ascii="Malgun Gothic" w:hAnsi="Malgun Gothic" w:eastAsia="Malgun Gothic"/>
+          <w:color w:val="000000"/>
           <w:sz w:val="22"/>
           <w:lang w:val="en-GB" w:eastAsia="ko-KR"/>
         </w:rPr>
@@ -1389,7 +1688,8 @@
       </w:r>
       <w:r>
         <w:rPr>
-          <w:rFonts w:hint="eastAsia"/>
+          <w:rFonts w:hint="eastAsia" w:ascii="Malgun Gothic" w:hAnsi="Malgun Gothic" w:eastAsia="Malgun Gothic"/>
+          <w:color w:val="000000"/>
           <w:sz w:val="22"/>
           <w:lang w:val="en-GB" w:eastAsia="ko-KR"/>
         </w:rPr>
@@ -1403,7 +1703,7 @@
           <w:ilvl w:val="0"/>
           <w:numId w:val="84"/>
         </w:numPr>
-        <w:spacing w:line="276" w:lineRule="auto"/>
+        <w:spacing w:line="276" w:lineRule="auto" w:before="40" w:after="60"/>
         <w:ind w:leftChars="0"/>
         <w:rPr>
           <w:sz w:val="22"/>
@@ -1412,7 +1712,8 @@
       </w:pPr>
       <w:r>
         <w:rPr>
-          <w:rFonts w:hint="eastAsia"/>
+          <w:rFonts w:hint="eastAsia" w:ascii="Malgun Gothic" w:hAnsi="Malgun Gothic" w:eastAsia="Malgun Gothic"/>
+          <w:color w:val="000000"/>
           <w:sz w:val="22"/>
           <w:lang w:val="en-GB" w:eastAsia="ko-KR"/>
         </w:rPr>
@@ -1421,7 +1722,7 @@
     </w:p>
     <w:p>
       <w:pPr>
-        <w:spacing w:line="276" w:lineRule="auto"/>
+        <w:spacing w:line="276" w:lineRule="auto" w:before="40" w:after="60"/>
         <w:rPr>
           <w:sz w:val="22"/>
           <w:lang w:val="en-GB" w:eastAsia="ko-KR"/>
@@ -1430,19 +1731,24 @@
     </w:p>
     <w:p>
       <w:pPr>
-        <w:spacing w:line="276" w:lineRule="auto"/>
+        <w:spacing w:line="276" w:lineRule="auto" w:before="40" w:after="60"/>
         <w:rPr>
           <w:sz w:val="22"/>
           <w:lang w:val="en-GB" w:eastAsia="ko-KR"/>
         </w:rPr>
       </w:pPr>
       <w:r>
+        <w:rPr>
+          <w:rFonts w:ascii="Malgun Gothic" w:hAnsi="Malgun Gothic" w:eastAsia="Malgun Gothic"/>
+          <w:color w:val="000000"/>
+          <w:sz w:val="22"/>
+        </w:rPr>
         <w:t>논평: {{decisionComment}}</w:t>
       </w:r>
     </w:p>
     <w:p>
       <w:pPr>
-        <w:spacing w:line="276" w:lineRule="auto"/>
+        <w:spacing w:line="276" w:lineRule="auto" w:before="40" w:after="60"/>
         <w:rPr>
           <w:sz w:val="22"/>
           <w:lang w:val="en-GB" w:eastAsia="ko-KR"/>
@@ -1451,7 +1757,7 @@
     </w:p>
     <w:p>
       <w:pPr>
-        <w:spacing w:line="276" w:lineRule="auto"/>
+        <w:spacing w:line="276" w:lineRule="auto" w:before="40" w:after="60"/>
         <w:rPr>
           <w:sz w:val="22"/>
           <w:lang w:val="en-GB" w:eastAsia="ko-KR"/>
@@ -1460,19 +1766,24 @@
     </w:p>
     <w:p>
       <w:pPr>
-        <w:spacing w:line="276" w:lineRule="auto"/>
+        <w:spacing w:line="276" w:lineRule="auto" w:before="40" w:after="60"/>
         <w:rPr>
           <w:sz w:val="22"/>
           <w:lang w:val="en-GB" w:eastAsia="ko-KR"/>
         </w:rPr>
       </w:pPr>
       <w:r>
+        <w:rPr>
+          <w:rFonts w:ascii="Malgun Gothic" w:hAnsi="Malgun Gothic" w:eastAsia="Malgun Gothic"/>
+          <w:color w:val="000000"/>
+          <w:sz w:val="22"/>
+        </w:rPr>
         <w:t>평가자: {{panelMembers}}</w:t>
       </w:r>
     </w:p>
     <w:p>
       <w:pPr>
-        <w:spacing w:line="276" w:lineRule="auto"/>
+        <w:spacing w:line="276" w:lineRule="auto" w:before="40" w:after="60"/>
         <w:rPr>
           <w:sz w:val="22"/>
           <w:lang w:val="en-GB" w:eastAsia="ko-KR"/>
@@ -1481,7 +1792,7 @@
     </w:p>
     <w:p>
       <w:pPr>
-        <w:spacing w:line="276" w:lineRule="auto"/>
+        <w:spacing w:line="276" w:lineRule="auto" w:before="40" w:after="60"/>
         <w:rPr>
           <w:sz w:val="22"/>
           <w:lang w:val="en-GB" w:eastAsia="ko-KR"/>
@@ -1490,7 +1801,7 @@
     </w:p>
     <w:p>
       <w:pPr>
-        <w:spacing w:line="276" w:lineRule="auto"/>
+        <w:spacing w:line="276" w:lineRule="auto" w:before="40" w:after="60"/>
         <w:rPr>
           <w:sz w:val="22"/>
           <w:lang w:val="en-GB" w:eastAsia="ko-KR"/>
@@ -1499,19 +1810,24 @@
     </w:p>
     <w:p>
       <w:pPr>
-        <w:spacing w:line="276" w:lineRule="auto"/>
+        <w:spacing w:line="276" w:lineRule="auto" w:before="40" w:after="60"/>
         <w:rPr>
           <w:sz w:val="22"/>
           <w:lang w:val="en-GB" w:eastAsia="ko-KR"/>
         </w:rPr>
       </w:pPr>
       <w:r>
+        <w:rPr>
+          <w:rFonts w:ascii="Malgun Gothic" w:hAnsi="Malgun Gothic" w:eastAsia="Malgun Gothic"/>
+          <w:color w:val="000000"/>
+          <w:sz w:val="22"/>
+        </w:rPr>
         <w:t>평가 일자: {{decisionDate}}</w:t>
       </w:r>
     </w:p>
     <w:p>
       <w:pPr>
-        <w:spacing w:line="276" w:lineRule="auto"/>
+        <w:spacing w:line="276" w:lineRule="auto" w:before="40" w:after="60"/>
         <w:rPr>
           <w:sz w:val="22"/>
           <w:lang w:val="en-GB" w:eastAsia="ko-KR"/>
@@ -1520,7 +1836,7 @@
     </w:p>
     <w:p>
       <w:pPr>
-        <w:spacing w:line="276" w:lineRule="auto"/>
+        <w:spacing w:line="276" w:lineRule="auto" w:before="40" w:after="60"/>
         <w:rPr>
           <w:sz w:val="22"/>
           <w:lang w:val="en-GB" w:eastAsia="ko-KR"/>
@@ -1529,7 +1845,7 @@
     </w:p>
     <w:p>
       <w:pPr>
-        <w:spacing w:line="276" w:lineRule="auto"/>
+        <w:spacing w:line="276" w:lineRule="auto" w:before="40" w:after="60"/>
         <w:rPr>
           <w:sz w:val="22"/>
           <w:lang w:val="en-GB" w:eastAsia="ko-KR"/>
@@ -1541,26 +1857,44 @@
         <w:tblStyle w:val="a6"/>
         <w:tblW w:w="0" w:type="auto"/>
         <w:tblBorders>
-          <w:top w:val="none" w:sz="0" w:space="0" w:color="auto"/>
-          <w:left w:val="none" w:sz="0" w:space="0" w:color="auto"/>
-          <w:bottom w:val="none" w:sz="0" w:space="0" w:color="auto"/>
-          <w:right w:val="none" w:sz="0" w:space="0" w:color="auto"/>
-          <w:insideH w:val="none" w:sz="0" w:space="0" w:color="auto"/>
-          <w:insideV w:val="none" w:sz="0" w:space="0" w:color="auto"/>
+          <w:top w:val="single" w:sz="4" w:space="0" w:color="D9D9D9"/>
+          <w:left w:val="single" w:sz="4" w:space="0" w:color="D9D9D9"/>
+          <w:bottom w:val="single" w:sz="4" w:space="0" w:color="D9D9D9"/>
+          <w:right w:val="single" w:sz="4" w:space="0" w:color="D9D9D9"/>
+          <w:insideH w:val="single" w:sz="4" w:space="0" w:color="D9D9D9"/>
+          <w:insideV w:val="single" w:sz="4" w:space="0" w:color="D9D9D9"/>
         </w:tblBorders>
         <w:tblLook w:val="04A0" w:firstRow="1" w:lastRow="0" w:firstColumn="1" w:lastColumn="0" w:noHBand="0" w:noVBand="1"/>
+        <w:tblCellMar>
+          <w:top w:w="75" w:type="dxa"/>
+          <w:bottom w:w="75" w:type="dxa"/>
+          <w:left w:w="100" w:type="dxa"/>
+          <w:right w:w="100" w:type="dxa"/>
+        </w:tblCellMar>
       </w:tblPr>
       <w:tblGrid>
         <w:gridCol w:w="7513"/>
         <w:gridCol w:w="2115"/>
       </w:tblGrid>
       <w:tr>
+        <w:trPr>
+          <w:cantSplit/>
+        </w:trPr>
         <w:tc>
           <w:tcPr>
             <w:tcW w:w="7513" w:type="dxa"/>
+            <w:vAlign w:val="center"/>
           </w:tcPr>
           <w:p>
+            <w:pPr>
+              <w:spacing w:before="40" w:after="60" w:line="276" w:lineRule="auto"/>
+            </w:pPr>
             <w:r>
+              <w:rPr>
+                <w:rFonts w:ascii="Malgun Gothic" w:hAnsi="Malgun Gothic" w:eastAsia="Malgun Gothic"/>
+                <w:color w:val="000000"/>
+                <w:sz w:val="22"/>
+              </w:rPr>
               <w:t>최종 승인자</w:t>
             </w:r>
           </w:p>
@@ -1571,21 +1905,42 @@
             <w:tcBorders>
               <w:bottom w:val="single" w:sz="4" w:space="0" w:color="auto"/>
             </w:tcBorders>
+            <w:vAlign w:val="center"/>
           </w:tcPr>
           <w:p>
+            <w:pPr>
+              <w:spacing w:before="40" w:after="60" w:line="276" w:lineRule="auto"/>
+            </w:pPr>
             <w:r>
+              <w:rPr>
+                <w:rFonts w:ascii="Malgun Gothic" w:hAnsi="Malgun Gothic" w:eastAsia="Malgun Gothic"/>
+                <w:color w:val="000000"/>
+                <w:sz w:val="22"/>
+              </w:rPr>
               <w:t>{{finalApprover}}</w:t>
             </w:r>
           </w:p>
         </w:tc>
       </w:tr>
       <w:tr>
+        <w:trPr>
+          <w:cantSplit/>
+        </w:trPr>
         <w:tc>
           <w:tcPr>
             <w:tcW w:w="7513" w:type="dxa"/>
+            <w:vAlign w:val="center"/>
           </w:tcPr>
           <w:p>
+            <w:pPr>
+              <w:spacing w:before="40" w:after="60" w:line="276" w:lineRule="auto"/>
+            </w:pPr>
             <w:r>
+              <w:rPr>
+                <w:rFonts w:ascii="Malgun Gothic" w:hAnsi="Malgun Gothic" w:eastAsia="Malgun Gothic"/>
+                <w:color w:val="000000"/>
+                <w:sz w:val="22"/>
+              </w:rPr>
               <w:t>최종 승인일</w:t>
             </w:r>
           </w:p>
@@ -1596,9 +1951,18 @@
             <w:tcBorders>
               <w:top w:val="single" w:sz="4" w:space="0" w:color="auto"/>
             </w:tcBorders>
+            <w:vAlign w:val="center"/>
           </w:tcPr>
           <w:p>
+            <w:pPr>
+              <w:spacing w:before="40" w:after="60" w:line="276" w:lineRule="auto"/>
+            </w:pPr>
             <w:r>
+              <w:rPr>
+                <w:rFonts w:ascii="Malgun Gothic" w:hAnsi="Malgun Gothic" w:eastAsia="Malgun Gothic"/>
+                <w:color w:val="000000"/>
+                <w:sz w:val="22"/>
+              </w:rPr>
               <w:t>{{finalApprovalDate}}</w:t>
               <w:br/>
               <w:t>President of GPC</w:t>
@@ -1609,7 +1973,7 @@
     </w:tbl>
     <w:p>
       <w:pPr>
-        <w:spacing w:line="276" w:lineRule="auto"/>
+        <w:spacing w:line="276" w:lineRule="auto" w:before="40" w:after="60"/>
         <w:rPr>
           <w:sz w:val="22"/>
           <w:lang w:val="en-GB" w:eastAsia="ko-KR"/>
@@ -1618,7 +1982,7 @@
     </w:p>
     <w:p>
       <w:pPr>
-        <w:spacing w:line="276" w:lineRule="auto"/>
+        <w:spacing w:line="276" w:lineRule="auto" w:before="40" w:after="60"/>
         <w:rPr>
           <w:sz w:val="22"/>
           <w:lang w:val="en-GB" w:eastAsia="ko-KR"/>
@@ -1633,7 +1997,7 @@
       <w:headerReference w:type="first" r:id="rId13"/>
       <w:footerReference w:type="first" r:id="rId14"/>
       <w:pgSz w:w="11906" w:h="16838" w:code="9"/>
-      <w:pgMar w:top="1418" w:right="1134" w:bottom="1418" w:left="1134" w:header="851" w:footer="454" w:gutter="0"/>
+      <w:pgMar w:top="1077" w:right="1020" w:bottom="1077" w:left="1020" w:header="851" w:footer="454" w:gutter="0"/>
       <w:cols w:space="425"/>
       <w:docGrid w:linePitch="360"/>
     </w:sectPr>
@@ -10954,10 +11318,14 @@
     <w:name w:val="Normal"/>
     <w:qFormat/>
     <w:rsid w:val="0047473C"/>
+    <w:pPr>
+      <w:spacing w:after="100" w:line="276" w:lineRule="auto"/>
+    </w:pPr>
     <w:rPr>
-      <w:rFonts w:ascii="Times New Roman" w:hAnsi="Times New Roman" w:cs="Times New Roman"/>
+      <w:rFonts w:ascii="Malgun Gothic" w:hAnsi="Malgun Gothic" w:cs="Times New Roman"/>
+      <w:color w:val="000000"/>
       <w:kern w:val="0"/>
-      <w:sz w:val="24"/>
+      <w:sz w:val="22"/>
       <w:szCs w:val="20"/>
       <w:lang w:eastAsia="en-US"/>
     </w:rPr>
@@ -11218,6 +11586,9 @@
       <w:szCs w:val="24"/>
       <w:lang w:val="cs-CZ" w:eastAsia="cs-CZ"/>
     </w:rPr>
+  </w:style>
+  <w:style w:type="paragraph" w:customStyle="1" w:styleId="Title">
+    <w:name w:val="Title"/>
   </w:style>
 </w:styles>
 </file>

</xml_diff>